<commit_message>
fix(docs): correct domain references — pezzaliapp.com / alessandropezzali.it
Replace non-existent domain pezzaliapp.it with the canonical
pezzaliapp.com in the manual (md + generator + regenerated docx).

Co-Authored-By: Claude Opus 4.7 (1M context) <noreply@anthropic.com>
</commit_message>
<xml_diff>
--- a/manuali/MANUALE_DrumAPPBass_v1.docx
+++ b/manuali/MANUALE_DrumAPPBass_v1.docx
@@ -223,7 +223,7 @@
                 <w:color w:val="1A1A22"/>
                 <w:sz w:val="21"/>
               </w:rPr>
-              <w:t>pezzaliapp.com · pezzaliapp.it</w:t>
+              <w:t>pezzaliapp.com</w:t>
             </w:r>
           </w:p>
         </w:tc>
@@ -471,7 +471,7 @@
     </w:p>
     <w:p>
       <w:r>
-        <w:t>La seconda fase è il rilascio pubblico sui siti dell'autore (pezzaliapp.com e pezzaliapp.it) e sulle directory pubbliche di applicazioni web. La data del rilascio pubblico non è dichiarata in anticipo; dipende dal feedback raccolto in fase di anteprima e dal completamento di eventuali raffinamenti.</w:t>
+        <w:t>La seconda fase è il rilascio pubblico sul sito dell'autore (pezzaliapp.com) e sulle directory pubbliche di applicazioni web. La data del rilascio pubblico non è dichiarata in anticipo; dipende dal feedback raccolto in fase di anteprima e dal completamento di eventuali raffinamenti.</w:t>
       </w:r>
     </w:p>
     <w:p>
@@ -8754,7 +8754,7 @@
         <w:pStyle w:val="ListBullet"/>
       </w:pPr>
       <w:r>
-        <w:t>Sito autore: pezzaliapp.com · pezzaliapp.it</w:t>
+        <w:t>Sito autore: pezzaliapp.com</w:t>
       </w:r>
     </w:p>
     <w:p>

</xml_diff>

<commit_message>
fix(docs): add alessandropezzali.it/DrumAPPBass as preferred app URL
The app live is hosted on two official URLs: alessandropezzali.it
(under the author's personal domain — preferred for community sharing)
and pezzaliapp.github.io (canonical GitHub Pages mirror, always
aligned with main). Update README, manual (md + docx) and the docx
generator so both are listed, with alessandropezzali.it first.

Co-Authored-By: Claude Opus 4.7 (1M context) <noreply@anthropic.com>
</commit_message>
<xml_diff>
--- a/manuali/MANUALE_DrumAPPBass_v1.docx
+++ b/manuali/MANUALE_DrumAPPBass_v1.docx
@@ -289,7 +289,7 @@
                 <w:color w:val="1A1A22"/>
                 <w:sz w:val="21"/>
               </w:rPr>
-              <w:t>pezzaliapp.github.io/DrumAPPBass</w:t>
+              <w:t>www.alessandropezzali.it/DrumAPPBass · pezzaliapp.github.io/DrumAPPBass</w:t>
             </w:r>
           </w:p>
         </w:tc>
@@ -8738,7 +8738,15 @@
         <w:pStyle w:val="ListBullet"/>
       </w:pPr>
       <w:r>
-        <w:t>App live: pezzaliapp.github.io/DrumAPPBass — versione canonica, sempre aggiornata.</w:t>
+        <w:t>App live: www.alessandropezzali.it/DrumAPPBass — sotto il dominio dell'autore (consigliato per condivisione).</w:t>
+      </w:r>
+    </w:p>
+    <w:p>
+      <w:pPr>
+        <w:pStyle w:val="ListBullet"/>
+      </w:pPr>
+      <w:r>
+        <w:t>App live (mirror canonico): pezzaliapp.github.io/DrumAPPBass — GitHub Pages, sempre allineato al main.</w:t>
       </w:r>
     </w:p>
     <w:p>

</xml_diff>

<commit_message>
fix(docs): pre-populate TOC in docx so manual is readable on mobile
Mobile readers (Pages iOS, Word Mobile opened from WhatsApp) do
not refresh dynamic TOC fields, leaving the manual without a
navigable index. Replace the dynamic TOC field with a build-time
populated text TOC: H1-H3 titles are collected as the document is
generated and written in place of the placeholder, indented by
level. No page numbers (would require a rendering engine), but
the section list is visible immediately on every reader.

Co-Authored-By: Claude Opus 4.7 (1M context) <noreply@anthropic.com>
</commit_message>
<xml_diff>
--- a/manuali/MANUALE_DrumAPPBass_v1.docx
+++ b/manuali/MANUALE_DrumAPPBass_v1.docx
@@ -360,12 +360,1121 @@
       </w:r>
     </w:p>
     <w:p>
-      <w:r>
-        <w:fldChar w:fldCharType="begin"/>
-        <w:instrText xml:space="preserve">TOC \o "1-3" \h \z \u</w:instrText>
-        <w:fldChar w:fldCharType="separate"/>
-        <w:t>Aggiorna l'indice con F9 (Word) o Cmd+Opt+Shift+U (Mac)</w:t>
-        <w:fldChar w:fldCharType="end"/>
+      <w:pPr>
+        <w:spacing w:before="120" w:after="40"/>
+      </w:pPr>
+      <w:r>
+        <w:rPr>
+          <w:b/>
+          <w:color w:val="F77F00"/>
+          <w:sz w:val="23"/>
+        </w:rPr>
+        <w:t>1. Introduzione</w:t>
+      </w:r>
+    </w:p>
+    <w:p>
+      <w:pPr>
+        <w:spacing w:after="20"/>
+        <w:ind w:left="340"/>
+      </w:pPr>
+      <w:r>
+        <w:rPr>
+          <w:color w:val="1A1A22"/>
+          <w:sz w:val="21"/>
+        </w:rPr>
+        <w:t>1.1 Cos'è DrumAPPBass</w:t>
+      </w:r>
+    </w:p>
+    <w:p>
+      <w:pPr>
+        <w:spacing w:after="20"/>
+        <w:ind w:left="340"/>
+      </w:pPr>
+      <w:r>
+        <w:rPr>
+          <w:color w:val="1A1A22"/>
+          <w:sz w:val="21"/>
+        </w:rPr>
+        <w:t>1.2 Filosofia</w:t>
+      </w:r>
+    </w:p>
+    <w:p>
+      <w:pPr>
+        <w:spacing w:after="20"/>
+        <w:ind w:left="340"/>
+      </w:pPr>
+      <w:r>
+        <w:rPr>
+          <w:color w:val="1A1A22"/>
+          <w:sz w:val="21"/>
+        </w:rPr>
+        <w:t>1.3 Posizionamento Weekend App</w:t>
+      </w:r>
+    </w:p>
+    <w:p>
+      <w:pPr>
+        <w:spacing w:after="20"/>
+        <w:ind w:left="340"/>
+      </w:pPr>
+      <w:r>
+        <w:rPr>
+          <w:color w:val="1A1A22"/>
+          <w:sz w:val="21"/>
+        </w:rPr>
+        <w:t>1.4 A chi si rivolge</w:t>
+      </w:r>
+    </w:p>
+    <w:p>
+      <w:pPr>
+        <w:spacing w:before="120" w:after="40"/>
+      </w:pPr>
+      <w:r>
+        <w:rPr>
+          <w:b/>
+          <w:color w:val="F77F00"/>
+          <w:sz w:val="23"/>
+        </w:rPr>
+        <w:t>2. Quick Start — cinque minuti</w:t>
+      </w:r>
+    </w:p>
+    <w:p>
+      <w:pPr>
+        <w:spacing w:after="20"/>
+        <w:ind w:left="340"/>
+      </w:pPr>
+      <w:r>
+        <w:rPr>
+          <w:color w:val="1A1A22"/>
+          <w:sz w:val="21"/>
+        </w:rPr>
+        <w:t>2.1 Aprire l'app</w:t>
+      </w:r>
+    </w:p>
+    <w:p>
+      <w:pPr>
+        <w:spacing w:after="20"/>
+        <w:ind w:left="340"/>
+      </w:pPr>
+      <w:r>
+        <w:rPr>
+          <w:color w:val="1A1A22"/>
+          <w:sz w:val="21"/>
+        </w:rPr>
+        <w:t>2.2 Caricare una demo</w:t>
+      </w:r>
+    </w:p>
+    <w:p>
+      <w:pPr>
+        <w:spacing w:after="20"/>
+        <w:ind w:left="340"/>
+      </w:pPr>
+      <w:r>
+        <w:rPr>
+          <w:color w:val="1A1A22"/>
+          <w:sz w:val="21"/>
+        </w:rPr>
+        <w:t>2.3 Suonare</w:t>
+      </w:r>
+    </w:p>
+    <w:p>
+      <w:pPr>
+        <w:spacing w:after="20"/>
+        <w:ind w:left="340"/>
+      </w:pPr>
+      <w:r>
+        <w:rPr>
+          <w:color w:val="1A1A22"/>
+          <w:sz w:val="21"/>
+        </w:rPr>
+        <w:t>2.4 Modificare</w:t>
+      </w:r>
+    </w:p>
+    <w:p>
+      <w:pPr>
+        <w:spacing w:after="20"/>
+        <w:ind w:left="340"/>
+      </w:pPr>
+      <w:r>
+        <w:rPr>
+          <w:color w:val="1A1A22"/>
+          <w:sz w:val="21"/>
+        </w:rPr>
+        <w:t>2.5 Salvare e condividere</w:t>
+      </w:r>
+    </w:p>
+    <w:p>
+      <w:pPr>
+        <w:spacing w:before="120" w:after="40"/>
+      </w:pPr>
+      <w:r>
+        <w:rPr>
+          <w:b/>
+          <w:color w:val="F77F00"/>
+          <w:sz w:val="23"/>
+        </w:rPr>
+        <w:t>3. Interfaccia generale</w:t>
+      </w:r>
+    </w:p>
+    <w:p>
+      <w:pPr>
+        <w:spacing w:after="20"/>
+        <w:ind w:left="340"/>
+      </w:pPr>
+      <w:r>
+        <w:rPr>
+          <w:color w:val="1A1A22"/>
+          <w:sz w:val="21"/>
+        </w:rPr>
+        <w:t>3.1 Layout</w:t>
+      </w:r>
+    </w:p>
+    <w:p>
+      <w:pPr>
+        <w:spacing w:after="20"/>
+        <w:ind w:left="340"/>
+      </w:pPr>
+      <w:r>
+        <w:rPr>
+          <w:color w:val="1A1A22"/>
+          <w:sz w:val="21"/>
+        </w:rPr>
+        <w:t>3.2 Palette e codici colore</w:t>
+      </w:r>
+    </w:p>
+    <w:p>
+      <w:pPr>
+        <w:spacing w:after="20"/>
+        <w:ind w:left="340"/>
+      </w:pPr>
+      <w:r>
+        <w:rPr>
+          <w:color w:val="1A1A22"/>
+          <w:sz w:val="21"/>
+        </w:rPr>
+        <w:t>3.3 Responsive</w:t>
+      </w:r>
+    </w:p>
+    <w:p>
+      <w:pPr>
+        <w:spacing w:before="120" w:after="40"/>
+      </w:pPr>
+      <w:r>
+        <w:rPr>
+          <w:b/>
+          <w:color w:val="F77F00"/>
+          <w:sz w:val="23"/>
+        </w:rPr>
+        <w:t>4. Drum Machine</w:t>
+      </w:r>
+    </w:p>
+    <w:p>
+      <w:pPr>
+        <w:spacing w:after="20"/>
+        <w:ind w:left="340"/>
+      </w:pPr>
+      <w:r>
+        <w:rPr>
+          <w:color w:val="1A1A22"/>
+          <w:sz w:val="21"/>
+        </w:rPr>
+        <w:t>4.1 Le otto voci</w:t>
+      </w:r>
+    </w:p>
+    <w:p>
+      <w:pPr>
+        <w:spacing w:after="20"/>
+        <w:ind w:left="340"/>
+      </w:pPr>
+      <w:r>
+        <w:rPr>
+          <w:color w:val="1A1A22"/>
+          <w:sz w:val="21"/>
+        </w:rPr>
+        <w:t>4.2 Il sequencer</w:t>
+      </w:r>
+    </w:p>
+    <w:p>
+      <w:pPr>
+        <w:spacing w:after="20"/>
+        <w:ind w:left="340"/>
+      </w:pPr>
+      <w:r>
+        <w:rPr>
+          <w:color w:val="1A1A22"/>
+          <w:sz w:val="21"/>
+        </w:rPr>
+        <w:t>4.3 Edit mode</w:t>
+      </w:r>
+    </w:p>
+    <w:p>
+      <w:pPr>
+        <w:spacing w:after="20"/>
+        <w:ind w:left="340"/>
+      </w:pPr>
+      <w:r>
+        <w:rPr>
+          <w:color w:val="1A1A22"/>
+          <w:sz w:val="21"/>
+        </w:rPr>
+        <w:t>4.4 Pattern multipli e song mode</w:t>
+      </w:r>
+    </w:p>
+    <w:p>
+      <w:pPr>
+        <w:spacing w:after="20"/>
+        <w:ind w:left="340"/>
+      </w:pPr>
+      <w:r>
+        <w:rPr>
+          <w:color w:val="1A1A22"/>
+          <w:sz w:val="21"/>
+        </w:rPr>
+        <w:t>4.5 Parametri di traccia</w:t>
+      </w:r>
+    </w:p>
+    <w:p>
+      <w:pPr>
+        <w:spacing w:after="20"/>
+        <w:ind w:left="340"/>
+      </w:pPr>
+      <w:r>
+        <w:rPr>
+          <w:color w:val="1A1A22"/>
+          <w:sz w:val="21"/>
+        </w:rPr>
+        <w:t>4.6 Mute e solo</w:t>
+      </w:r>
+    </w:p>
+    <w:p>
+      <w:pPr>
+        <w:spacing w:after="20"/>
+        <w:ind w:left="340"/>
+      </w:pPr>
+      <w:r>
+        <w:rPr>
+          <w:color w:val="1A1A22"/>
+          <w:sz w:val="21"/>
+        </w:rPr>
+        <w:t>4.7 Master mixer</w:t>
+      </w:r>
+    </w:p>
+    <w:p>
+      <w:pPr>
+        <w:spacing w:before="120" w:after="40"/>
+      </w:pPr>
+      <w:r>
+        <w:rPr>
+          <w:b/>
+          <w:color w:val="F77F00"/>
+          <w:sz w:val="23"/>
+        </w:rPr>
+        <w:t>5. Bass Synth</w:t>
+      </w:r>
+    </w:p>
+    <w:p>
+      <w:pPr>
+        <w:spacing w:after="20"/>
+        <w:ind w:left="340"/>
+      </w:pPr>
+      <w:r>
+        <w:rPr>
+          <w:color w:val="1A1A22"/>
+          <w:sz w:val="21"/>
+        </w:rPr>
+        <w:t>5.1 Architettura</w:t>
+      </w:r>
+    </w:p>
+    <w:p>
+      <w:pPr>
+        <w:spacing w:after="20"/>
+        <w:ind w:left="340"/>
+      </w:pPr>
+      <w:r>
+        <w:rPr>
+          <w:color w:val="1A1A22"/>
+          <w:sz w:val="21"/>
+        </w:rPr>
+        <w:t>5.2 STEP mode — il sequencer del basso</w:t>
+      </w:r>
+    </w:p>
+    <w:p>
+      <w:pPr>
+        <w:spacing w:after="20"/>
+        <w:ind w:left="340"/>
+      </w:pPr>
+      <w:r>
+        <w:rPr>
+          <w:color w:val="1A1A22"/>
+          <w:sz w:val="21"/>
+        </w:rPr>
+        <w:t>5.3 EDIT mode bass</w:t>
+      </w:r>
+    </w:p>
+    <w:p>
+      <w:pPr>
+        <w:spacing w:after="20"/>
+        <w:ind w:left="340"/>
+      </w:pPr>
+      <w:r>
+        <w:rPr>
+          <w:color w:val="1A1A22"/>
+          <w:sz w:val="21"/>
+        </w:rPr>
+        <w:t>5.4 LOOPER mode</w:t>
+      </w:r>
+    </w:p>
+    <w:p>
+      <w:pPr>
+        <w:spacing w:after="20"/>
+        <w:ind w:left="340"/>
+      </w:pPr>
+      <w:r>
+        <w:rPr>
+          <w:color w:val="1A1A22"/>
+          <w:sz w:val="21"/>
+        </w:rPr>
+        <w:t>5.5 Parametri di traccia bass</w:t>
+      </w:r>
+    </w:p>
+    <w:p>
+      <w:pPr>
+        <w:spacing w:after="20"/>
+        <w:ind w:left="340"/>
+      </w:pPr>
+      <w:r>
+        <w:rPr>
+          <w:color w:val="1A1A22"/>
+          <w:sz w:val="21"/>
+        </w:rPr>
+        <w:t>5.6 Routing MIDI</w:t>
+      </w:r>
+    </w:p>
+    <w:p>
+      <w:pPr>
+        <w:spacing w:before="120" w:after="40"/>
+      </w:pPr>
+      <w:r>
+        <w:rPr>
+          <w:b/>
+          <w:color w:val="F77F00"/>
+          <w:sz w:val="23"/>
+        </w:rPr>
+        <w:t>6. Performance Modes</w:t>
+      </w:r>
+    </w:p>
+    <w:p>
+      <w:pPr>
+        <w:spacing w:after="20"/>
+        <w:ind w:left="340"/>
+      </w:pPr>
+      <w:r>
+        <w:rPr>
+          <w:color w:val="1A1A22"/>
+          <w:sz w:val="21"/>
+        </w:rPr>
+        <w:t>6.1 Idea</w:t>
+      </w:r>
+    </w:p>
+    <w:p>
+      <w:pPr>
+        <w:spacing w:after="20"/>
+        <w:ind w:left="340"/>
+      </w:pPr>
+      <w:r>
+        <w:rPr>
+          <w:color w:val="1A1A22"/>
+          <w:sz w:val="21"/>
+        </w:rPr>
+        <w:t>6.2 Le quattro modalità</w:t>
+      </w:r>
+    </w:p>
+    <w:p>
+      <w:pPr>
+        <w:spacing w:after="20"/>
+        <w:ind w:left="340"/>
+      </w:pPr>
+      <w:r>
+        <w:rPr>
+          <w:color w:val="1A1A22"/>
+          <w:sz w:val="21"/>
+        </w:rPr>
+        <w:t>6.3 Quando usare quale</w:t>
+      </w:r>
+    </w:p>
+    <w:p>
+      <w:pPr>
+        <w:spacing w:after="20"/>
+        <w:ind w:left="340"/>
+      </w:pPr>
+      <w:r>
+        <w:rPr>
+          <w:color w:val="1A1A22"/>
+          <w:sz w:val="21"/>
+        </w:rPr>
+        <w:t>6.4 Switching live</w:t>
+      </w:r>
+    </w:p>
+    <w:p>
+      <w:pPr>
+        <w:spacing w:after="20"/>
+        <w:ind w:left="340"/>
+      </w:pPr>
+      <w:r>
+        <w:rPr>
+          <w:color w:val="1A1A22"/>
+          <w:sz w:val="21"/>
+        </w:rPr>
+        <w:t>6.5 Persistenza</w:t>
+      </w:r>
+    </w:p>
+    <w:p>
+      <w:pPr>
+        <w:spacing w:before="120" w:after="40"/>
+      </w:pPr>
+      <w:r>
+        <w:rPr>
+          <w:b/>
+          <w:color w:val="F77F00"/>
+          <w:sz w:val="23"/>
+        </w:rPr>
+        <w:t>7. Demo Library</w:t>
+      </w:r>
+    </w:p>
+    <w:p>
+      <w:pPr>
+        <w:spacing w:after="20"/>
+        <w:ind w:left="340"/>
+      </w:pPr>
+      <w:r>
+        <w:rPr>
+          <w:color w:val="1A1A22"/>
+          <w:sz w:val="21"/>
+        </w:rPr>
+        <w:t>7.1 Catalogo</w:t>
+      </w:r>
+    </w:p>
+    <w:p>
+      <w:pPr>
+        <w:spacing w:after="20"/>
+        <w:ind w:left="340"/>
+      </w:pPr>
+      <w:r>
+        <w:rPr>
+          <w:color w:val="1A1A22"/>
+          <w:sz w:val="21"/>
+        </w:rPr>
+        <w:t>7.2 Demo modern</w:t>
+      </w:r>
+    </w:p>
+    <w:p>
+      <w:pPr>
+        <w:spacing w:after="20"/>
+        <w:ind w:left="340"/>
+      </w:pPr>
+      <w:r>
+        <w:rPr>
+          <w:color w:val="1A1A22"/>
+          <w:sz w:val="21"/>
+        </w:rPr>
+        <w:t>7.3 Demo iconic</w:t>
+      </w:r>
+    </w:p>
+    <w:p>
+      <w:pPr>
+        <w:spacing w:after="20"/>
+        <w:ind w:left="340"/>
+      </w:pPr>
+      <w:r>
+        <w:rPr>
+          <w:color w:val="1A1A22"/>
+          <w:sz w:val="21"/>
+        </w:rPr>
+        <w:t>7.4 Demo classic break</w:t>
+      </w:r>
+    </w:p>
+    <w:p>
+      <w:pPr>
+        <w:spacing w:after="20"/>
+        <w:ind w:left="340"/>
+      </w:pPr>
+      <w:r>
+        <w:rPr>
+          <w:color w:val="1A1A22"/>
+          <w:sz w:val="21"/>
+        </w:rPr>
+        <w:t>7.5 Demo bass curate</w:t>
+      </w:r>
+    </w:p>
+    <w:p>
+      <w:pPr>
+        <w:spacing w:after="20"/>
+        <w:ind w:left="340"/>
+      </w:pPr>
+      <w:r>
+        <w:rPr>
+          <w:color w:val="1A1A22"/>
+          <w:sz w:val="21"/>
+        </w:rPr>
+        <w:t>7.6 Demo performance modes</w:t>
+      </w:r>
+    </w:p>
+    <w:p>
+      <w:pPr>
+        <w:spacing w:after="20"/>
+        <w:ind w:left="340"/>
+      </w:pPr>
+      <w:r>
+        <w:rPr>
+          <w:color w:val="1A1A22"/>
+          <w:sz w:val="21"/>
+        </w:rPr>
+        <w:t>7.7 Caricare e scaricare le demo</w:t>
+      </w:r>
+    </w:p>
+    <w:p>
+      <w:pPr>
+        <w:spacing w:before="120" w:after="40"/>
+      </w:pPr>
+      <w:r>
+        <w:rPr>
+          <w:b/>
+          <w:color w:val="F77F00"/>
+          <w:sz w:val="23"/>
+        </w:rPr>
+        <w:t>8. Workflow esempi</w:t>
+      </w:r>
+    </w:p>
+    <w:p>
+      <w:pPr>
+        <w:spacing w:after="20"/>
+        <w:ind w:left="340"/>
+      </w:pPr>
+      <w:r>
+        <w:rPr>
+          <w:color w:val="1A1A22"/>
+          <w:sz w:val="21"/>
+        </w:rPr>
+        <w:t>8.1 Costruire una traccia da zero</w:t>
+      </w:r>
+    </w:p>
+    <w:p>
+      <w:pPr>
+        <w:spacing w:after="20"/>
+        <w:ind w:left="340"/>
+      </w:pPr>
+      <w:r>
+        <w:rPr>
+          <w:color w:val="1A1A22"/>
+          <w:sz w:val="21"/>
+        </w:rPr>
+        <w:t>8.2 Ricreare un genere</w:t>
+      </w:r>
+    </w:p>
+    <w:p>
+      <w:pPr>
+        <w:spacing w:after="20"/>
+        <w:ind w:left="340"/>
+      </w:pPr>
+      <w:r>
+        <w:rPr>
+          <w:color w:val="1A1A22"/>
+          <w:sz w:val="21"/>
+        </w:rPr>
+        <w:t>8.3 Live looper bass</w:t>
+      </w:r>
+    </w:p>
+    <w:p>
+      <w:pPr>
+        <w:spacing w:after="20"/>
+        <w:ind w:left="340"/>
+      </w:pPr>
+      <w:r>
+        <w:rPr>
+          <w:color w:val="1A1A22"/>
+          <w:sz w:val="21"/>
+        </w:rPr>
+        <w:t>8.4 Confrontare le Performance Modes</w:t>
+      </w:r>
+    </w:p>
+    <w:p>
+      <w:pPr>
+        <w:spacing w:before="120" w:after="40"/>
+      </w:pPr>
+      <w:r>
+        <w:rPr>
+          <w:b/>
+          <w:color w:val="F77F00"/>
+          <w:sz w:val="23"/>
+        </w:rPr>
+        <w:t>9. Funzionalità avanzate</w:t>
+      </w:r>
+    </w:p>
+    <w:p>
+      <w:pPr>
+        <w:spacing w:after="20"/>
+        <w:ind w:left="340"/>
+      </w:pPr>
+      <w:r>
+        <w:rPr>
+          <w:color w:val="1A1A22"/>
+          <w:sz w:val="21"/>
+        </w:rPr>
+        <w:t>9.1 Slot localStorage A/B/C/D</w:t>
+      </w:r>
+    </w:p>
+    <w:p>
+      <w:pPr>
+        <w:spacing w:after="20"/>
+        <w:ind w:left="340"/>
+      </w:pPr>
+      <w:r>
+        <w:rPr>
+          <w:color w:val="1A1A22"/>
+          <w:sz w:val="21"/>
+        </w:rPr>
+        <w:t>9.2 Export / Import JSON v3</w:t>
+      </w:r>
+    </w:p>
+    <w:p>
+      <w:pPr>
+        <w:spacing w:after="20"/>
+        <w:ind w:left="340"/>
+      </w:pPr>
+      <w:r>
+        <w:rPr>
+          <w:color w:val="1A1A22"/>
+          <w:sz w:val="21"/>
+        </w:rPr>
+        <w:t>9.3 SHARE link</w:t>
+      </w:r>
+    </w:p>
+    <w:p>
+      <w:pPr>
+        <w:spacing w:after="20"/>
+        <w:ind w:left="340"/>
+      </w:pPr>
+      <w:r>
+        <w:rPr>
+          <w:color w:val="1A1A22"/>
+          <w:sz w:val="21"/>
+        </w:rPr>
+        <w:t>9.4 BOUNCE WAV</w:t>
+      </w:r>
+    </w:p>
+    <w:p>
+      <w:pPr>
+        <w:spacing w:after="20"/>
+        <w:ind w:left="340"/>
+      </w:pPr>
+      <w:r>
+        <w:rPr>
+          <w:color w:val="1A1A22"/>
+          <w:sz w:val="21"/>
+        </w:rPr>
+        <w:t>9.5 REC live</w:t>
+      </w:r>
+    </w:p>
+    <w:p>
+      <w:pPr>
+        <w:spacing w:after="20"/>
+        <w:ind w:left="340"/>
+      </w:pPr>
+      <w:r>
+        <w:rPr>
+          <w:color w:val="1A1A22"/>
+          <w:sz w:val="21"/>
+        </w:rPr>
+        <w:t>9.6 Web MIDI out</w:t>
+      </w:r>
+    </w:p>
+    <w:p>
+      <w:pPr>
+        <w:spacing w:after="20"/>
+        <w:ind w:left="340"/>
+      </w:pPr>
+      <w:r>
+        <w:rPr>
+          <w:color w:val="1A1A22"/>
+          <w:sz w:val="21"/>
+        </w:rPr>
+        <w:t>9.7 Undo / Redo</w:t>
+      </w:r>
+    </w:p>
+    <w:p>
+      <w:pPr>
+        <w:spacing w:after="20"/>
+        <w:ind w:left="340"/>
+      </w:pPr>
+      <w:r>
+        <w:rPr>
+          <w:color w:val="1A1A22"/>
+          <w:sz w:val="21"/>
+        </w:rPr>
+        <w:t>9.8 Copy / Paste pattern</w:t>
+      </w:r>
+    </w:p>
+    <w:p>
+      <w:pPr>
+        <w:spacing w:after="20"/>
+        <w:ind w:left="340"/>
+      </w:pPr>
+      <w:r>
+        <w:rPr>
+          <w:color w:val="1A1A22"/>
+          <w:sz w:val="21"/>
+        </w:rPr>
+        <w:t>9.9 Tap tempo</w:t>
+      </w:r>
+    </w:p>
+    <w:p>
+      <w:pPr>
+        <w:spacing w:after="20"/>
+        <w:ind w:left="340"/>
+      </w:pPr>
+      <w:r>
+        <w:rPr>
+          <w:color w:val="1A1A22"/>
+          <w:sz w:val="21"/>
+        </w:rPr>
+        <w:t>9.10 Humanize e metronomo</w:t>
+      </w:r>
+    </w:p>
+    <w:p>
+      <w:pPr>
+        <w:spacing w:before="120" w:after="40"/>
+      </w:pPr>
+      <w:r>
+        <w:rPr>
+          <w:b/>
+          <w:color w:val="F77F00"/>
+          <w:sz w:val="23"/>
+        </w:rPr>
+        <w:t>10. Shortcut tastiera</w:t>
+      </w:r>
+    </w:p>
+    <w:p>
+      <w:pPr>
+        <w:spacing w:after="20"/>
+        <w:ind w:left="340"/>
+      </w:pPr>
+      <w:r>
+        <w:rPr>
+          <w:color w:val="1A1A22"/>
+          <w:sz w:val="21"/>
+        </w:rPr>
+        <w:t>10.1 Globali</w:t>
+      </w:r>
+    </w:p>
+    <w:p>
+      <w:pPr>
+        <w:spacing w:after="20"/>
+        <w:ind w:left="340"/>
+      </w:pPr>
+      <w:r>
+        <w:rPr>
+          <w:color w:val="1A1A22"/>
+          <w:sz w:val="21"/>
+        </w:rPr>
+        <w:t>10.2 Solo in modalità LOOPER bass</w:t>
+      </w:r>
+    </w:p>
+    <w:p>
+      <w:pPr>
+        <w:spacing w:before="120" w:after="40"/>
+      </w:pPr>
+      <w:r>
+        <w:rPr>
+          <w:b/>
+          <w:color w:val="F77F00"/>
+          <w:sz w:val="23"/>
+        </w:rPr>
+        <w:t>11. Feature roadmap</w:t>
+      </w:r>
+    </w:p>
+    <w:p>
+      <w:pPr>
+        <w:spacing w:after="20"/>
+        <w:ind w:left="340"/>
+      </w:pPr>
+      <w:r>
+        <w:rPr>
+          <w:color w:val="1A1A22"/>
+          <w:sz w:val="21"/>
+        </w:rPr>
+        <w:t>11.1 DrumAPPBass-Studio: sample-based bass</w:t>
+      </w:r>
+    </w:p>
+    <w:p>
+      <w:pPr>
+        <w:spacing w:after="20"/>
+        <w:ind w:left="340"/>
+      </w:pPr>
+      <w:r>
+        <w:rPr>
+          <w:color w:val="1A1A22"/>
+          <w:sz w:val="21"/>
+        </w:rPr>
+        <w:t>11.2 Filtro per voce in WIDE mode</w:t>
+      </w:r>
+    </w:p>
+    <w:p>
+      <w:pPr>
+        <w:spacing w:after="20"/>
+        <w:ind w:left="340"/>
+      </w:pPr>
+      <w:r>
+        <w:rPr>
+          <w:color w:val="1A1A22"/>
+          <w:sz w:val="21"/>
+        </w:rPr>
+        <w:t>11.3 Modalità FM / PWM</w:t>
+      </w:r>
+    </w:p>
+    <w:p>
+      <w:pPr>
+        <w:spacing w:after="20"/>
+        <w:ind w:left="340"/>
+      </w:pPr>
+      <w:r>
+        <w:rPr>
+          <w:color w:val="1A1A22"/>
+          <w:sz w:val="21"/>
+        </w:rPr>
+        <w:t>11.4 Compressore master sul bass bus</w:t>
+      </w:r>
+    </w:p>
+    <w:p>
+      <w:pPr>
+        <w:spacing w:after="20"/>
+        <w:ind w:left="340"/>
+      </w:pPr>
+      <w:r>
+        <w:rPr>
+          <w:color w:val="1A1A22"/>
+          <w:sz w:val="21"/>
+        </w:rPr>
+        <w:t>11.5 Espansione delle demo per modalità</w:t>
+      </w:r>
+    </w:p>
+    <w:p>
+      <w:pPr>
+        <w:spacing w:after="20"/>
+        <w:ind w:left="340"/>
+      </w:pPr>
+      <w:r>
+        <w:rPr>
+          <w:color w:val="1A1A22"/>
+          <w:sz w:val="21"/>
+        </w:rPr>
+        <w:t>11.6 MIDI in (input esterno)</w:t>
+      </w:r>
+    </w:p>
+    <w:p>
+      <w:pPr>
+        <w:spacing w:after="20"/>
+        <w:ind w:left="340"/>
+      </w:pPr>
+      <w:r>
+        <w:rPr>
+          <w:color w:val="1A1A22"/>
+          <w:sz w:val="21"/>
+        </w:rPr>
+        <w:t>11.7 Mobile UX improvements</w:t>
+      </w:r>
+    </w:p>
+    <w:p>
+      <w:pPr>
+        <w:spacing w:after="20"/>
+        <w:ind w:left="340"/>
+      </w:pPr>
+      <w:r>
+        <w:rPr>
+          <w:color w:val="1A1A22"/>
+          <w:sz w:val="21"/>
+        </w:rPr>
+        <w:t>11.8 Versione internazionale del manuale</w:t>
+      </w:r>
+    </w:p>
+    <w:p>
+      <w:pPr>
+        <w:spacing w:after="20"/>
+        <w:ind w:left="340"/>
+      </w:pPr>
+      <w:r>
+        <w:rPr>
+          <w:color w:val="1A1A22"/>
+          <w:sz w:val="21"/>
+        </w:rPr>
+        <w:t>11.9 Esportazioni alternative</w:t>
+      </w:r>
+    </w:p>
+    <w:p>
+      <w:pPr>
+        <w:spacing w:after="20"/>
+        <w:ind w:left="340"/>
+      </w:pPr>
+      <w:r>
+        <w:rPr>
+          <w:color w:val="1A1A22"/>
+          <w:sz w:val="21"/>
+        </w:rPr>
+        <w:t>11.10 Engagement community</w:t>
+      </w:r>
+    </w:p>
+    <w:p>
+      <w:pPr>
+        <w:spacing w:before="120" w:after="40"/>
+      </w:pPr>
+      <w:r>
+        <w:rPr>
+          <w:b/>
+          <w:color w:val="F77F00"/>
+          <w:sz w:val="23"/>
+        </w:rPr>
+        <w:t>12. FAQ</w:t>
+      </w:r>
+    </w:p>
+    <w:p>
+      <w:pPr>
+        <w:spacing w:before="120" w:after="40"/>
+      </w:pPr>
+      <w:r>
+        <w:rPr>
+          <w:b/>
+          <w:color w:val="F77F00"/>
+          <w:sz w:val="23"/>
+        </w:rPr>
+        <w:t>13. Risorse, licenza e contatti</w:t>
+      </w:r>
+    </w:p>
+    <w:p>
+      <w:pPr>
+        <w:spacing w:after="20"/>
+        <w:ind w:left="340"/>
+      </w:pPr>
+      <w:r>
+        <w:rPr>
+          <w:color w:val="1A1A22"/>
+          <w:sz w:val="21"/>
+        </w:rPr>
+        <w:t>13.1 Link</w:t>
+      </w:r>
+    </w:p>
+    <w:p>
+      <w:pPr>
+        <w:spacing w:after="20"/>
+        <w:ind w:left="340"/>
+      </w:pPr>
+      <w:r>
+        <w:rPr>
+          <w:color w:val="1A1A22"/>
+          <w:sz w:val="21"/>
+        </w:rPr>
+        <w:t>13.2 Come dare feedback</w:t>
+      </w:r>
+    </w:p>
+    <w:p>
+      <w:pPr>
+        <w:spacing w:after="20"/>
+        <w:ind w:left="340"/>
+      </w:pPr>
+      <w:r>
+        <w:rPr>
+          <w:color w:val="1A1A22"/>
+          <w:sz w:val="21"/>
+        </w:rPr>
+        <w:t>13.3 Licenza</w:t>
+      </w:r>
+    </w:p>
+    <w:p>
+      <w:pPr>
+        <w:spacing w:after="20"/>
+        <w:ind w:left="340"/>
+      </w:pPr>
+      <w:r>
+        <w:rPr>
+          <w:color w:val="1A1A22"/>
+          <w:sz w:val="21"/>
+        </w:rPr>
+        <w:t>13.4 Note legali</w:t>
+      </w:r>
+    </w:p>
+    <w:p>
+      <w:pPr>
+        <w:spacing w:before="120" w:after="40"/>
+      </w:pPr>
+      <w:r>
+        <w:rPr>
+          <w:b/>
+          <w:color w:val="F77F00"/>
+          <w:sz w:val="23"/>
+        </w:rPr>
+        <w:t>14. Appendice tecnica</w:t>
+      </w:r>
+    </w:p>
+    <w:p>
+      <w:pPr>
+        <w:spacing w:after="20"/>
+        <w:ind w:left="340"/>
+      </w:pPr>
+      <w:r>
+        <w:rPr>
+          <w:color w:val="1A1A22"/>
+          <w:sz w:val="21"/>
+        </w:rPr>
+        <w:t>14.1 Architettura della sintesi</w:t>
+      </w:r>
+    </w:p>
+    <w:p>
+      <w:pPr>
+        <w:spacing w:after="20"/>
+        <w:ind w:left="340"/>
+      </w:pPr>
+      <w:r>
+        <w:rPr>
+          <w:color w:val="1A1A22"/>
+          <w:sz w:val="21"/>
+        </w:rPr>
+        <w:t>14.2 Formato JSON v3</w:t>
+      </w:r>
+    </w:p>
+    <w:p>
+      <w:pPr>
+        <w:spacing w:after="20"/>
+        <w:ind w:left="340"/>
+      </w:pPr>
+      <w:r>
+        <w:rPr>
+          <w:color w:val="1A1A22"/>
+          <w:sz w:val="21"/>
+        </w:rPr>
+        <w:t>14.3 Performance Modes — dettaglio interno</w:t>
+      </w:r>
+    </w:p>
+    <w:p>
+      <w:pPr>
+        <w:spacing w:after="20"/>
+        <w:ind w:left="340"/>
+      </w:pPr>
+      <w:r>
+        <w:rPr>
+          <w:color w:val="1A1A22"/>
+          <w:sz w:val="21"/>
+        </w:rPr>
+        <w:t>14.4 Limiti noti</w:t>
+      </w:r>
+    </w:p>
+    <w:p>
+      <w:pPr>
+        <w:spacing w:after="20"/>
+        <w:ind w:left="340"/>
+      </w:pPr>
+      <w:r>
+        <w:rPr>
+          <w:color w:val="1A1A22"/>
+          <w:sz w:val="21"/>
+        </w:rPr>
+        <w:t>14.5 Cambio di versione</w:t>
       </w:r>
     </w:p>
     <w:p>

</xml_diff>